<commit_message>
Add master-admin instant Unlock for locked admin accounts
- Backend: new adminUnlock action (master only) clears the 10-minute
  failed-attempt lock immediately, capped at 4 unlocks per account per
  hour so it can never be scripted into disabling the brute-force brake;
  adminData now returns each admin's live lock status to the master; the
  lock check in login/set-password now runs after the membership check so
  outsiders cannot probe who is locked
- Admin portal: Lock Status card in the Login Activity tab lists every
  admin (OK / failed attempts / LOCKED) with an Unlock now button; the
  demo backend simulates the 5-failure lock with a real 10-minute expiry
- Docs: README and the beginner manual explain the instant unlock

Co-Authored-By: Claude Fable 5 <noreply@anthropic.com>
Claude-Session: https://claude.ai/code/session_01HuQZzogMBEn7GvJK74AkKz
</commit_message>
<xml_diff>
--- a/docs/Bid-Portal-Manual.docx
+++ b/docs/Bid-Portal-Manual.docx
@@ -3167,7 +3167,7 @@
         <w:t xml:space="preserve">Lockout: </w:t>
       </w:r>
       <w:r>
-        <w:t xml:space="preserve">five wrong attempts lock that e-mail for 10 minutes.</w:t>
+        <w:t xml:space="preserve">five wrong attempts lock that e-mail for 10 minutes. It unlocks by itself when the time is up, or the master admin presses Unlock now in the Login Activity tab to free the person immediately.</w:t>
       </w:r>
     </w:p>
     <w:p>
@@ -3234,7 +3234,7 @@
         <w:t xml:space="preserve">Master admin extras: </w:t>
       </w:r>
       <w:r>
-        <w:t xml:space="preserve">the first e-mail in the admin list is the MASTER admin — only that account sees the Login Activity tab (who signed in, failed attempts, lockouts, password creations) and can DELETE an auction. Deleting removes the auction only; its recorded bids stay in the register as archived.</w:t>
+        <w:t xml:space="preserve">the first e-mail in the admin list is the MASTER admin — only that account sees the Login Activity tab (a lock-status table of every admin account with an Unlock now button, above the trail of who signed in, failed attempts, lockouts, unlocks and password creations) and can DELETE an auction. Deleting removes the auction only; its recorded bids stay in the register as archived.</w:t>
       </w:r>
     </w:p>
     <w:p>
@@ -4168,7 +4168,7 @@
                 <w:sz w:val="20"/>
                 <w:szCs w:val="20"/>
               </w:rPr>
-              <w:t xml:space="preserve">Five wrong tries locks that e-mail for 10 minutes. Wait, then try again carefully.</w:t>
+              <w:t xml:space="preserve">Five wrong tries locks that e-mail for 10 minutes. Wait it out and try again carefully — or ask the master admin to press Unlock now in the Login Activity tab (instant).</w:t>
             </w:r>
           </w:p>
         </w:tc>

</xml_diff>

<commit_message>
Add master-admin instant Unlock for locked admin accounts (#23)
- Backend: new adminUnlock action (master only) clears the 10-minute
  failed-attempt lock immediately, capped at 4 unlocks per account per
  hour so it can never be scripted into disabling the brute-force brake;
  adminData now returns each admin's live lock status to the master; the
  lock check in login/set-password now runs after the membership check so
  outsiders cannot probe who is locked
- Admin portal: Lock Status card in the Login Activity tab lists every
  admin (OK / failed attempts / LOCKED) with an Unlock now button; the
  demo backend simulates the 5-failure lock with a real 10-minute expiry
- Docs: README and the beginner manual explain the instant unlock


Claude-Session: https://claude.ai/code/session_01HuQZzogMBEn7GvJK74AkKz

Co-authored-by: Claude <noreply@anthropic.com>
</commit_message>
<xml_diff>
--- a/docs/Bid-Portal-Manual.docx
+++ b/docs/Bid-Portal-Manual.docx
@@ -3167,7 +3167,7 @@
         <w:t xml:space="preserve">Lockout: </w:t>
       </w:r>
       <w:r>
-        <w:t xml:space="preserve">five wrong attempts lock that e-mail for 10 minutes.</w:t>
+        <w:t xml:space="preserve">five wrong attempts lock that e-mail for 10 minutes. It unlocks by itself when the time is up, or the master admin presses Unlock now in the Login Activity tab to free the person immediately.</w:t>
       </w:r>
     </w:p>
     <w:p>
@@ -3234,7 +3234,7 @@
         <w:t xml:space="preserve">Master admin extras: </w:t>
       </w:r>
       <w:r>
-        <w:t xml:space="preserve">the first e-mail in the admin list is the MASTER admin — only that account sees the Login Activity tab (who signed in, failed attempts, lockouts, password creations) and can DELETE an auction. Deleting removes the auction only; its recorded bids stay in the register as archived.</w:t>
+        <w:t xml:space="preserve">the first e-mail in the admin list is the MASTER admin — only that account sees the Login Activity tab (a lock-status table of every admin account with an Unlock now button, above the trail of who signed in, failed attempts, lockouts, unlocks and password creations) and can DELETE an auction. Deleting removes the auction only; its recorded bids stay in the register as archived.</w:t>
       </w:r>
     </w:p>
     <w:p>
@@ -4168,7 +4168,7 @@
                 <w:sz w:val="20"/>
                 <w:szCs w:val="20"/>
               </w:rPr>
-              <w:t xml:space="preserve">Five wrong tries locks that e-mail for 10 minutes. Wait, then try again carefully.</w:t>
+              <w:t xml:space="preserve">Five wrong tries locks that e-mail for 10 minutes. Wait it out and try again carefully — or ask the master admin to press Unlock now in the Login Activity tab (instant).</w:t>
             </w:r>
           </w:p>
         </w:tc>

</xml_diff>